<commit_message>
3Q 2026 report: asset chart commentary without per-class numbers; prompt updated
Co-Authored-By: Claude <noreply@anthropic.com>
Claude-Session: https://claude.ai/code/session_01Wz4hTuCY2EwSUbAgh1Yfhz
</commit_message>
<xml_diff>
--- a/vystupy/ctvrtletni-zpravy/2026-Q3-Ctvrtletni-zprava-Portu.docx
+++ b/vystupy/ctvrtletni-zpravy/2026-Q3-Ctvrtletni-zprava-Portu.docx
@@ -163,12 +163,17 @@
     </w:p>
     <w:p>
       <w:r>
-        <w:t xml:space="preserve">Graf dobře ukazuje, jak rozdílně se ve třetím čtvrtletí dařilo jednotlivým třídám aktiv. Nejvíce vydělaly americké akcie, které přidaly 2,9 % v dolarech a 4,1 % v korunách, a zlato s růstem o 1,9 %, v korunách o 3,2 %. Mírně rostly i japonské akcie (1,7 %, v korunách 2,6 %), přestože japonský index Nikkei 225 v jenech za čtvrtletí ztratil. Zahraničnímu investorovi totiž pomohla japonská měna, která vůči dolaru posílila o více než 3 %. Evropské akcie skončily zhruba na nule (−0,6 % v eurech, 0,2 % v korunách).</w:t>
-      </w:r>
-    </w:p>
-    <w:p>
-      <w:r>
-        <w:t xml:space="preserve">Na opačném konci grafu stojí dluhopisy. Dlouhodobé americké státní dluhopisy odepsaly 8,5 % (v korunách 7,4 %) a evropské firemní dluhopisy 2,6 % (v korunách 1,8 %). V plusu skončily jen krátkodobé americké dluhopisy, které vydělaly 0,9 % v dolarech a 2,1 % v korunách. U všech tříd aktiv je korunový výnos vyšší než výnos v původní měně, protože koruna během čtvrtletí mírně oslabila. Zlato, které drží rizikové profily 1–6, znovu ukázalo svou roli v diverzifikaci: jeho cena se často pohybuje jinak než ceny akcií a dluhopisů, a v čtvrtletí, kdy dluhopisy výrazně zlevnily, tak portfoliím pomohlo.</w:t>
+        <w:t xml:space="preserve">Graf dobře ukazuje, jak rozdílně se ve třetím čtvrtletí dařilo jednotlivým třídám aktiv. Nahoře skončily americké akcie, které táhla silná výsledková sezóna, a zlato. Mírně rostly i japonské akcie, přestože japonský index Nikkei 225 v jenech za čtvrtletí ztratil. Pro zahraničního investora výsledek zachránila japonská měna, která vůči dolaru posílila o více než 3 %. Evropské akcie skončily zhruba na nule, protože srpnové rekordy smazal zářijový růst sazeb.</w:t>
+      </w:r>
+    </w:p>
+    <w:p>
+      <w:r>
+        <w:t xml:space="preserve">Na opačném konci grafu stojí dluhopisy. Nejvíce ztratily dlouhodobé americké státní dluhopisy, které doplatily na prudký růst výnosů, jak popisujeme v kapitole o dluhopisech. Zlevnily i evropské firemní dluhopisy. V plusu skončily jen krátkodobé americké dluhopisy, kterým rostoucí sazby tolik neublíží a které z vyššího úroku naopak těží. Zlato, které drží rizikové profily 1–6, znovu ukázalo svou roli v diverzifikaci: jeho cena se často pohybuje jinak než ceny akcií a dluhopisů, a v čtvrtletí, kdy dluhopisy výrazně zlevnily, tak portfoliím pomohlo.</w:t>
+      </w:r>
+    </w:p>
+    <w:p>
+      <w:r>
+        <w:t xml:space="preserve">Za pozornost stojí i rozdíl mezi výnosem v původní měně a v korunách. U všech tříd aktiv vyšel korunový výnos zhruba o procentní bod vyšší, protože koruna během čtvrtletí mírně oslabila. U dolarových aktiv byl rozdíl o něco větší než u eurových, protože koruna oslabila víc vůči dolaru než vůči euru.</w:t>
       </w:r>
     </w:p>
     <w:p>

</xml_diff>

<commit_message>
3Q 2026 report: describe movements instead of chart positions; prompt rule
Co-Authored-By: Claude <noreply@anthropic.com>
Claude-Session: https://claude.ai/code/session_01Wz4hTuCY2EwSUbAgh1Yfhz
</commit_message>
<xml_diff>
--- a/vystupy/ctvrtletni-zpravy/2026-Q3-Ctvrtletni-zprava-Portu.docx
+++ b/vystupy/ctvrtletni-zpravy/2026-Q3-Ctvrtletni-zprava-Portu.docx
@@ -163,12 +163,12 @@
     </w:p>
     <w:p>
       <w:r>
-        <w:t xml:space="preserve">Graf dobře ukazuje, jak rozdílně se ve třetím čtvrtletí dařilo jednotlivým třídám aktiv. Nahoře skončily americké akcie, které táhla silná výsledková sezóna, a zlato. Mírně rostly i japonské akcie, přestože japonský index Nikkei 225 v jenech za čtvrtletí ztratil. Pro zahraničního investora výsledek zachránila japonská měna, která vůči dolaru posílila o více než 3 %. Evropské akcie skončily zhruba na nule, protože srpnové rekordy smazal zářijový růst sazeb.</w:t>
-      </w:r>
-    </w:p>
-    <w:p>
-      <w:r>
-        <w:t xml:space="preserve">Na opačném konci grafu stojí dluhopisy. Nejvíce ztratily dlouhodobé americké státní dluhopisy, které doplatily na prudký růst výnosů, jak popisujeme v kapitole o dluhopisech. Zlevnily i evropské firemní dluhopisy. V plusu skončily jen krátkodobé americké dluhopisy, kterým rostoucí sazby tolik neublíží a které z vyššího úroku naopak těží. Zlato, které drží rizikové profily 1–6, znovu ukázalo svou roli v diverzifikaci: jeho cena se často pohybuje jinak než ceny akcií a dluhopisů, a v čtvrtletí, kdy dluhopisy výrazně zlevnily, tak portfoliím pomohlo.</w:t>
+        <w:t xml:space="preserve">Graf dobře ukazuje, jak rozdílně se ve třetím čtvrtletí dařilo jednotlivým třídám aktiv. Nejvíce se dařilo americkým akciím, které táhla silná výsledková sezóna, a v plusu skončilo i zlato. Mírně rostly i japonské akcie, přestože japonský index Nikkei 225 v jenech za čtvrtletí ztratil. Pro zahraničního investora výsledek zachránila japonská měna, která vůči dolaru posílila o více než 3 %. Evropské akcie skončily zhruba na nule, protože srpnové rekordy smazal zářijový růst sazeb.</w:t>
+      </w:r>
+    </w:p>
+    <w:p>
+      <w:r>
+        <w:t xml:space="preserve">Dluhopisy naopak převážně ztrácely. Nejvíce ztratily dlouhodobé americké státní dluhopisy, které doplatily na prudký růst výnosů, jak popisujeme v kapitole o dluhopisech. Zlevnily i evropské firemní dluhopisy. V plusu skončily jen krátkodobé americké dluhopisy, kterým rostoucí sazby tolik neublíží a které z vyššího úroku naopak těží. Zlato, které drží rizikové profily 1–6, znovu ukázalo svou roli v diverzifikaci: jeho cena se často pohybuje jinak než ceny akcií a dluhopisů, a v čtvrtletí, kdy dluhopisy výrazně zlevnily, tak portfoliím pomohlo.</w:t>
       </w:r>
     </w:p>
     <w:p>

</xml_diff>

<commit_message>
3Q 2026 report: no commentary under asset class chart (as in past reports); prompt updated
Co-Authored-By: Claude <noreply@anthropic.com>
Claude-Session: https://claude.ai/code/session_01Wz4hTuCY2EwSUbAgh1Yfhz
</commit_message>
<xml_diff>
--- a/vystupy/ctvrtletni-zpravy/2026-Q3-Ctvrtletni-zprava-Portu.docx
+++ b/vystupy/ctvrtletni-zpravy/2026-Q3-Ctvrtletni-zprava-Portu.docx
@@ -162,21 +162,6 @@
       </w:r>
     </w:p>
     <w:p>
-      <w:r>
-        <w:t xml:space="preserve">Graf dobře ukazuje, jak rozdílně se ve třetím čtvrtletí dařilo jednotlivým třídám aktiv. Nejvíce se dařilo americkým akciím, které táhla silná výsledková sezóna, a v plusu skončilo i zlato. Mírně rostly i japonské akcie, přestože japonský index Nikkei 225 v jenech za čtvrtletí ztratil. Pro zahraničního investora výsledek zachránila japonská měna, která vůči dolaru posílila o více než 3 %. Evropské akcie skončily zhruba na nule, protože srpnové rekordy smazal zářijový růst sazeb.</w:t>
-      </w:r>
-    </w:p>
-    <w:p>
-      <w:r>
-        <w:t xml:space="preserve">Dluhopisy naopak převážně ztrácely. Nejvíce ztratily dlouhodobé americké státní dluhopisy, které doplatily na prudký růst výnosů, jak popisujeme v kapitole o dluhopisech. Zlevnily i evropské firemní dluhopisy. V plusu skončily jen krátkodobé americké dluhopisy, kterým rostoucí sazby tolik neublíží a které z vyššího úroku naopak těží. Zlato, které drží rizikové profily 1–6, znovu ukázalo svou roli v diverzifikaci: jeho cena se často pohybuje jinak než ceny akcií a dluhopisů, a v čtvrtletí, kdy dluhopisy výrazně zlevnily, tak portfoliím pomohlo.</w:t>
-      </w:r>
-    </w:p>
-    <w:p>
-      <w:r>
-        <w:t xml:space="preserve">Za pozornost stojí i rozdíl mezi výnosem v původní měně a v korunách. U všech tříd aktiv vyšel korunový výnos zhruba o procentní bod vyšší, protože koruna během čtvrtletí mírně oslabila. U dolarových aktiv byl rozdíl o něco větší než u eurových, protože koruna oslabila víc vůči dolaru než vůči euru.</w:t>
-      </w:r>
-    </w:p>
-    <w:p>
       <w:pPr>
         <w:pStyle w:val="Heading2"/>
       </w:pPr>
@@ -465,7 +450,7 @@
     </w:p>
     <w:p>
       <w:r>
-        <w:t xml:space="preserve">Pro portfolia s dluhopisovou složkou to byl nejvýraznější negativní vliv čtvrtletí. Dlouhodobé americké státní dluhopisy, které drží rizikové profily 6–9, ztratily 8,5 % a evropské firemní dluhopisy, které mají profily 1–6, ztratily 2,6 %. Mechanismus je jednoduchý: když trh nabízí nové dluhopisy s vyšším úrokem, ty starší s nižším úrokem musí zlevnit, a čím delší je splatnost, tím víc. Má to ale i druhou stranu. Americké státní dluhopisy dnes nesou nejvyšší výnosy za téměř dvě dekády, a kdo je drží do budoucna, bude z nich dostávat výrazně vyšší příjem než v minulých letech. Krátkodobé americké dluhopisy, které tvoří velkou část konzervativních profilů 1–3, ve čtvrtletí vydělaly.</w:t>
+        <w:t xml:space="preserve">Pro portfolia s dluhopisovou složkou to byl nejvýraznější negativní vliv čtvrtletí. Dlouhodobé americké státní dluhopisy, které drží rizikové profily 6–9, ztratily 8,5 % a evropské firemní dluhopisy, které mají profily 1–6, ztratily 2,6 %. Mechanismus je jednoduchý: když trh nabízí nové dluhopisy s vyšším úrokem, ty starší s nižším úrokem musí zlevnit, a čím delší je splatnost, tím víc. Má to ale i druhou stranu. Americké státní dluhopisy dnes nesou nejvyšší výnosy za téměř dvě dekády, a kdo je drží do budoucna, bude z nich dostávat výrazně vyšší příjem než v minulých letech. Krátkodobé americké dluhopisy, které tvoří velkou část konzervativních profilů 1–3, ve čtvrtletí vydělaly. Pomohlo i zlato, které drží rizikové profily 1–6. Znovu ukázalo svou roli v diverzifikaci: jeho cena se často pohybuje jinak než ceny akcií a dluhopisů, a ve čtvrtletí, kdy dluhopisy výrazně zlevnily, skončilo v plusu.</w:t>
       </w:r>
     </w:p>
     <w:p>

</xml_diff>

<commit_message>
3Q 2026 report: explain duration effect once, in returns section
Co-Authored-By: Claude <noreply@anthropic.com>
Claude-Session: https://claude.ai/code/session_01Wz4hTuCY2EwSUbAgh1Yfhz
</commit_message>
<xml_diff>
--- a/vystupy/ctvrtletni-zpravy/2026-Q3-Ctvrtletni-zprava-Portu.docx
+++ b/vystupy/ctvrtletni-zpravy/2026-Q3-Ctvrtletni-zprava-Portu.docx
@@ -176,7 +176,7 @@
     </w:p>
     <w:p>
       <w:r>
-        <w:t xml:space="preserve">Tentokrát se nejvíce nedařilo dluhopisové složce. Když rostou úrokové sazby, klesá cena dluhopisů, které už investoři drží, a nejvíce to zasáhne dluhopisy s nejdelší splatností. Ze sledovaných portfolií ztratilo nejvíce Portfolio 6. Zhruba čtvrtinu prostředků má v dluhopisech, včetně dlouhodobých amerických státních a firemních dluhopisů, a v jeho akciové části jsou i akcie menších firem, kterým se nedařilo. Čistě akciové Portfolio 10 skončilo těsně pod nulou. Zisky amerických akcií u něj smazaly ztráty akcií menších firem a části rozvojových trhů, o kterých píšeme níže.</w:t>
+        <w:t xml:space="preserve">Tentokrát se nejvíce nedařilo dluhopisové složce. Když rostou úrokové sazby, klesá cena dluhopisů, které už investoři drží, a nejvíce to zasáhne dluhopisy s nejdelší splatností. Čím déle totiž dluhopis do splatnosti zbývá, tím déle jeho majitel dostává nižší úrok, než nabízejí nové dluhopisy, a o to víc musí jeho cena klesnout, aby byl pro kupce stále zajímavý. Ze sledovaných portfolií ztratilo nejvíce Portfolio 6. Zhruba čtvrtinu prostředků má v dluhopisech, včetně dlouhodobých amerických státních a firemních dluhopisů, a v jeho akciové části jsou i akcie menších firem, kterým se nedařilo. Čistě akciové Portfolio 10 skončilo těsně pod nulou. Zisky amerických akcií u něj smazaly ztráty akcií menších firem a části rozvojových trhů, o kterých píšeme níže.</w:t>
       </w:r>
     </w:p>
     <w:p>
@@ -450,7 +450,7 @@
     </w:p>
     <w:p>
       <w:r>
-        <w:t xml:space="preserve">Pro portfolia s dluhopisovou složkou to byl nejvýraznější negativní vliv čtvrtletí. Dlouhodobé americké státní dluhopisy, které drží rizikové profily 6–9, ztratily 8,5 % a evropské firemní dluhopisy, které mají profily 1–6, ztratily 2,6 %. Mechanismus je jednoduchý: když trh nabízí nové dluhopisy s vyšším úrokem, ty starší s nižším úrokem musí zlevnit, a čím delší je splatnost, tím víc. Má to ale i druhou stranu. Americké státní dluhopisy dnes nesou nejvyšší výnosy za téměř dvě dekády, a kdo je drží do budoucna, bude z nich dostávat výrazně vyšší příjem než v minulých letech. Krátkodobé americké dluhopisy, které tvoří velkou část konzervativních profilů 1–3, ve čtvrtletí vydělaly. Pomohlo i zlato, které drží rizikové profily 1–6. Znovu ukázalo svou roli v diverzifikaci: jeho cena se často pohybuje jinak než ceny akcií a dluhopisů, a ve čtvrtletí, kdy dluhopisy výrazně zlevnily, skončilo v plusu.</w:t>
+        <w:t xml:space="preserve">Pro portfolia s dluhopisovou složkou to byl nejvýraznější negativní vliv čtvrtletí. Dlouhodobé americké státní dluhopisy, které drží rizikové profily 6–9, ztratily 8,5 % a evropské firemní dluhopisy, které mají profily 1–6, ztratily 2,6 %. Má to ale i druhou stranu. Americké státní dluhopisy dnes nesou nejvyšší výnosy za téměř dvě dekády, a kdo je drží do budoucna, bude z nich dostávat výrazně vyšší příjem než v minulých letech. Krátkodobé americké dluhopisy, které tvoří velkou část konzervativních profilů 1–3, ve čtvrtletí vydělaly. Pomohlo i zlato, které drží rizikové profily 1–6. Znovu ukázalo svou roli v diverzifikaci: jeho cena se často pohybuje jinak než ceny akcií a dluhopisů, a ve čtvrtletí, kdy dluhopisy výrazně zlevnily, skončilo v plusu.</w:t>
       </w:r>
     </w:p>
     <w:p>

</xml_diff>

<commit_message>
3Q 2026 report: clarify why portfolio 6 lost most (bond share, lower US equity weight)
Co-Authored-By: Claude <noreply@anthropic.com>
Claude-Session: https://claude.ai/code/session_01Wz4hTuCY2EwSUbAgh1Yfhz
</commit_message>
<xml_diff>
--- a/vystupy/ctvrtletni-zpravy/2026-Q3-Ctvrtletni-zprava-Portu.docx
+++ b/vystupy/ctvrtletni-zpravy/2026-Q3-Ctvrtletni-zprava-Portu.docx
@@ -176,7 +176,7 @@
     </w:p>
     <w:p>
       <w:r>
-        <w:t xml:space="preserve">Tentokrát se nejvíce nedařilo dluhopisové složce. Když rostou úrokové sazby, klesá cena dluhopisů, které už investoři drží, a nejvíce to zasáhne dluhopisy s nejdelší splatností. Čím déle totiž dluhopis do splatnosti zbývá, tím déle jeho majitel dostává nižší úrok, než nabízejí nové dluhopisy, a o to víc musí jeho cena klesnout, aby byl pro kupce stále zajímavý. Ze sledovaných portfolií ztratilo nejvíce Portfolio 6. Zhruba čtvrtinu prostředků má v dluhopisech, včetně dlouhodobých amerických státních a firemních dluhopisů, a v jeho akciové části jsou i akcie menších firem, kterým se nedařilo. Čistě akciové Portfolio 10 skončilo těsně pod nulou. Zisky amerických akcií u něj smazaly ztráty akcií menších firem a části rozvojových trhů, o kterých píšeme níže.</w:t>
+        <w:t xml:space="preserve">Tentokrát se nejvíce nedařilo dluhopisové složce. Když rostou úrokové sazby, klesá cena dluhopisů, které už investoři drží, a nejvíce to zasáhne dluhopisy s nejdelší splatností. Čím déle totiž dluhopis do splatnosti zbývá, tím déle jeho majitel dostává nižší úrok, než nabízejí nové dluhopisy, a o to víc musí jeho cena klesnout, aby byl pro kupce stále zajímavý. Ze sledovaných portfolií ztratilo nejvíce Portfolio 6. Čtvrtinu prostředků má v dluhopisech, z toho 4,2 % v dlouhodobých amerických státních dluhopisech se splatností 20 a více let. Americké akcie, kterým se ve čtvrtletí dařilo, v něm přitom tvoří jen necelou třetinu, zatímco v Portfoliu 10 je to 44 %. Čistě akciové Portfolio 10 skončilo těsně pod nulou. Zisky amerických akcií u něj smazaly ztráty akcií menších firem a části rozvojových trhů, o kterých píšeme níže.</w:t>
       </w:r>
     </w:p>
     <w:p>
@@ -249,7 +249,7 @@
     </w:p>
     <w:p>
       <w:r>
-        <w:t xml:space="preserve">Portfolio s rizikovostí 3 ve třetím čtvrtletí ztratilo 0,8 % a od začátku roku je v plusu 4,3 %. Portfolio 6 odepsalo 2,3 % a za letošek drží zisk 8,0 %. Nejdynamičtější Portfolio 10 skončilo čtvrtletí na −0,5 % a od ledna vydělalo 14,5 %. Že nejvíce ztratilo prostřední Portfolio 6, a ne nejdynamičtější desítka, ukazuje, že tentokrát nerozhodoval jen podíl akcií. Svou roli hrálo i to, kolik má portfolio dluhopisů s dlouhou splatností, které v létě zlevnily nejvíce.</w:t>
+        <w:t xml:space="preserve">Portfolio s rizikovostí 3 ve třetím čtvrtletí ztratilo 0,8 % a od začátku roku je v plusu 4,3 %. Portfolio 6 odepsalo 2,3 % a za letošek drží zisk 8,0 %. Nejdynamičtější Portfolio 10 skončilo čtvrtletí na −0,5 % a od ledna vydělalo 14,5 %. Že nejvíce ztratilo prostřední Portfolio 6, a ne nejdynamičtější desítka, ukazuje, že tentokrát nerozhodoval jen podíl akcií. Svou roli hrálo i to, jak velkou část má portfolio v dluhopisech, které v létě převážně zlevnily, a jak velkou v amerických akciích, které rostly.</w:t>
       </w:r>
     </w:p>
     <w:p>

</xml_diff>

<commit_message>
3Q 2026 report: drop DIP fee note; prompt: no product news in report
Co-Authored-By: Claude <noreply@anthropic.com>
Claude-Session: https://claude.ai/code/session_01Wz4hTuCY2EwSUbAgh1Yfhz
</commit_message>
<xml_diff>
--- a/vystupy/ctvrtletni-zpravy/2026-Q3-Ctvrtletni-zprava-Portu.docx
+++ b/vystupy/ctvrtletni-zpravy/2026-Q3-Ctvrtletni-zprava-Portu.docx
@@ -185,11 +185,6 @@
       </w:r>
     </w:p>
     <w:p>
-      <w:r>
-        <w:t xml:space="preserve">Klienty s dlouhodobým investičním produktem (DIP) potěší ještě jedna změna: od září jsme snížili poplatek za jeho správu z 0,5 % na 0,3 % ročně.</w:t>
-      </w:r>
-    </w:p>
-    <w:p>
       <w:pPr>
         <w:spacing w:after="120" w:before="120"/>
         <w:jc w:val="center"/>

</xml_diff>

<commit_message>
3Q 2026 report: neutral expectation check, explain 10Y benchmark; prompt rules
Co-Authored-By: Claude <noreply@anthropic.com>
Claude-Session: https://claude.ai/code/session_01Wz4hTuCY2EwSUbAgh1Yfhz
</commit_message>
<xml_diff>
--- a/vystupy/ctvrtletni-zpravy/2026-Q3-Ctvrtletni-zprava-Portu.docx
+++ b/vystupy/ctvrtletni-zpravy/2026-Q3-Ctvrtletni-zprava-Portu.docx
@@ -303,7 +303,7 @@
     </w:p>
     <w:p>
       <w:r>
-        <w:t xml:space="preserve">Ve zprávě za druhé čtvrtletí jsme psali, že americké sazby podle nás zůstanou do konce roku beze změny. Mýlili jsme se. Inflace v USA sice z květnových 4,2 % klesla, v červenci i srpnu se ale držela na 3,4 %, tedy vysoko nad dvouprocentním cílem. Nový růst cen ropy navíc hrozil, že se inflace usadí natrvalo.</w:t>
+        <w:t xml:space="preserve">Ve zprávě za druhé čtvrtletí jsme počítali s tím, že americké sazby zůstanou do konce roku beze změny. Vývoj inflace ale Fed přiměl jednat. Inflace v USA sice z květnových 4,2 % klesla, v červenci i srpnu se ale držela na 3,4 %, tedy vysoko nad dvouprocentním cílem. Nový růst cen ropy navíc hrozil, že se inflace usadí natrvalo.</w:t>
       </w:r>
     </w:p>
     <w:p>
@@ -383,7 +383,7 @@
     </w:p>
     <w:p>
       <w:r>
-        <w:t xml:space="preserve">Výnos desetiletého amerického státního dluhopisu vzrostl ze 4,47 % na konci června na 5,29 % na konci září, nejvýše od roku 2007. Výnos třicetiletého dluhopisu se zvýšil ze 4,97 % na 5,63 %. Vedle inflace a Fedu za tím stojí i rostoucí obavy z amerického zadlužení. Veřejný dluh USA 18. srpna poprvé překonal 40 bilionů dolarů, jen necelých pět měsíců po hranici 39 bilionů. Ministerstvo financí sice zvýšilo zpětné odkupy nejdelších dluhopisů, aby jejich výnosy zbrzdilo, trh to ale natrvalo neuklidnilo. Další nejistotu přidal Trumpův slib vyplatit každému dospělému Američanovi 5 000 dolarů, pokud republikáni ve volbách udrží obě komory Kongresu. Takový krok by stál zhruba 1,2 bilionu dolarů.</w:t>
+        <w:t xml:space="preserve">Výnos desetiletého amerického státního dluhopisu vzrostl ze 4,47 % na konci června na 5,29 % na konci září, nejvýše od roku 2007. Právě desetiletý americký dluhopis sledují investoři po celém světě nejvíc, protože slouží jako měřítko ceny dlouhodobých peněz: odvozují se od něj úroky amerických hypoték i firemních úvěrů a investoři s ním porovnávají, zda se jim vyplatí držet akcie. Jeho výnos navíc odráží nejen aktuální sazby Fedu, ale i to, jakou inflaci a zadlužení trh čeká v příštích letech. Výnos třicetiletého dluhopisu se zvýšil ze 4,97 % na 5,63 %. Vedle inflace a Fedu za tím stojí i rostoucí obavy z amerického zadlužení. Veřejný dluh USA 18. srpna poprvé překonal 40 bilionů dolarů, jen necelých pět měsíců po hranici 39 bilionů. Ministerstvo financí sice zvýšilo zpětné odkupy nejdelších dluhopisů, aby jejich výnosy zbrzdilo, trh to ale natrvalo neuklidnilo. Další nejistotu přidal Trumpův slib vyplatit každému dospělému Američanovi 5 000 dolarů, pokud republikáni ve volbách udrží obě komory Kongresu. Takový krok by stál zhruba 1,2 bilionu dolarů.</w:t>
       </w:r>
     </w:p>
     <w:p>

</xml_diff>

<commit_message>
3Q 2026 report: expand France section (fiscal, politics, Italy, euro)
Co-Authored-By: Claude <noreply@anthropic.com>
Claude-Session: https://claude.ai/code/session_01Wz4hTuCY2EwSUbAgh1Yfhz
</commit_message>
<xml_diff>
--- a/vystupy/ctvrtletni-zpravy/2026-Q3-Ctvrtletni-zprava-Portu.docx
+++ b/vystupy/ctvrtletni-zpravy/2026-Q3-Ctvrtletni-zprava-Portu.docx
@@ -440,7 +440,17 @@
     </w:p>
     <w:p>
       <w:r>
-        <w:t xml:space="preserve">Totéž se dělo v Evropě. Výnos desetiletého německého dluhopisu vzrostl za čtvrtletí z 2,86 % na 3,58 %. Francie si kvůli rozpočtovým potížím půjčuje na deset let za 4,84 %, dráž než Itálie a o 1,27 procentního bodu dráž než Německo. Tento rozdíl ukazuje, o kolik vyšší odměnu investoři žádají za riziko francouzských veřejných financí, a tak velký nebyl od roku 2012, kdy vrcholila dluhová krize eurozóny.</w:t>
+        <w:t xml:space="preserve">Totéž se dělo v Evropě. Výnos desetiletého německého dluhopisu vzrostl za čtvrtletí z 2,86 % na 3,58 %. Nejvíce ale byla pod tlakem Francie. Ta si na deset let půjčuje za 4,84 %, dráž než Itálie a o 1,27 procentního bodu dráž než Německo. Tento rozdíl ukazuje, o kolik vyšší odměnu investoři žádají za riziko francouzských veřejných financí, a tak velký nebyl od roku 2012, kdy vrcholila dluhová krize eurozóny.</w:t>
+      </w:r>
+    </w:p>
+    <w:p>
+      <w:r>
+        <w:t xml:space="preserve">Francie potřebuje dlouhodobě ozdravit veřejné finance. Letošní schodek dosáhne 5,4 % HDP místo plánovaných 5 % a dluh se blíží 120 % HDP. Vláda premiéra Lecornua proto navrhuje úspory za 54 miliard eur, v rozděleném parlamentu je ale nemusí prosadit. Nejistotu zvyšují i jarní prezidentské volby. Favoritkou průzkumů je Marine Le Penová a radikálně levicový kandidát Jean-Luc Mélenchon navrhuje zrušit státní dluhopisy, které drží francouzská centrální banka a ECB. Šéfka ECB Christine Lagardeová to označila za čisté porušení evropských smluv. Investoři, pravděpodobně hlavně zahraniční, proto francouzské dluhopisy ve velkém prodávali a žádají za ně vyšší rizikovou přirážku. Zhoršená nálada se přelila i do Itálie, kde výnosy desetiletých dluhopisů za tři měsíce vzrostly zhruba o procentní bod. Německé dluhopisy, které investoři považují za bezpečnější, na samém konci září naopak mírně zpevnily.</w:t>
+      </w:r>
+    </w:p>
+    <w:p>
+      <w:r>
+        <w:t xml:space="preserve">Výprodej francouzských dluhopisů považujeme spíš za krátkodobou záležitost. Kdyby ale pokračoval, byl by rizikem pro všechny typy evropských aktiv: dluhopisy, akcie, zejména bank, které francouzské dluhopisy drží, i samotné euro. To už ve třetím čtvrtletí oslabilo vůči dolaru zhruba o 0,8 %, protože americké dluhopisy nabízejí vyšší výnos a evropská aktiva ztrácela část přízně investorů. Pro českého investora to má i druhou stranu: koruna se pohybuje spíš spolu s eurem, takže slabší euro obvykle znamená i slabší korunu vůči dolaru a vyšší korunovou hodnotu dolarových investic.</w:t>
       </w:r>
     </w:p>
     <w:p>

</xml_diff>

<commit_message>
3Q 2026 report: integrate chief economist's outlook; move France view to outlook
Co-Authored-By: Claude <noreply@anthropic.com>
Claude-Session: https://claude.ai/code/session_01Wz4hTuCY2EwSUbAgh1Yfhz
</commit_message>
<xml_diff>
--- a/vystupy/ctvrtletni-zpravy/2026-Q3-Ctvrtletni-zprava-Portu.docx
+++ b/vystupy/ctvrtletni-zpravy/2026-Q3-Ctvrtletni-zprava-Portu.docx
@@ -450,7 +450,7 @@
     </w:p>
     <w:p>
       <w:r>
-        <w:t xml:space="preserve">Výprodej francouzských dluhopisů považujeme spíš za krátkodobou záležitost. Kdyby ale pokračoval, byl by rizikem pro všechny typy evropských aktiv: dluhopisy, akcie, zejména bank, které francouzské dluhopisy drží, i samotné euro. To už ve třetím čtvrtletí oslabilo vůči dolaru zhruba o 0,8 %, protože americké dluhopisy nabízejí vyšší výnos a evropská aktiva ztrácela část přízně investorů. Pro českého investora to má i druhou stranu: koruna se pohybuje spíš spolu s eurem, takže slabší euro obvykle znamená i slabší korunu vůči dolaru a vyšší korunovou hodnotu dolarových investic.</w:t>
+        <w:t xml:space="preserve">Pod tlakem bylo i euro. Ve třetím čtvrtletí oslabilo vůči dolaru zhruba o 0,8 %, protože americké dluhopisy nabízejí vyšší výnos a evropská aktiva ztrácela část přízně investorů. Pro českého investora to má i druhou stranu: koruna se pohybuje spíš spolu s eurem, takže slabší euro obvykle znamená i slabší korunu vůči dolaru a vyšší korunovou hodnotu dolarových investic.</w:t>
       </w:r>
     </w:p>
     <w:p>
@@ -506,17 +506,22 @@
     </w:p>
     <w:p>
       <w:r>
-        <w:t xml:space="preserve">Klíčovou proměnnou zůstává Blízký východ. Pokud se podaří obnovit volnou plavbu Hormuzským průlivem a opravit saúdský ropovod, ropa může rychle zlevnit, podobně jako na jaře. S ní by polevila inflace a centrální banky by mohly s dalším zvyšováním sazeb přestat. Pokud konflikt přetrvá, počítáme s dražší energií, vyšší inflací a dalším tlakem na sazby i dluhopisy.</w:t>
-      </w:r>
-    </w:p>
-    <w:p>
-      <w:r>
-        <w:t xml:space="preserve">Druhou proměnnou jsou sazby a veřejné finance. Fed signalizuje ještě jedno zvýšení do konce roku. Trh bude bedlivě sledovat volby do Kongresu 3. listopadu, předvolební sliby i to, jak snadno se USA a Francie dokážou financovat. Případný další prudký růst výnosů by byl hlavním rizikem pro dluhopisy i pro akcie s vysokým oceněním.</w:t>
-      </w:r>
-    </w:p>
-    <w:p>
-      <w:r>
-        <w:t xml:space="preserve">Třetí proměnnou jsou firemní zisky. Analytici pro výsledkovou sezónu za třetí čtvrtletí, která startuje v říjnu, čekají meziroční růst zisků S&amp;P 500 o necelých 30 %. Pokud se to potvrdí, ocenění akcií zůstane rozumné i po letošním růstu. Riziko vidíme hlavně v tom, že by firmy začaly drahou energii a dražší úvěry pociťovat ve svých maržích.</w:t>
+        <w:t xml:space="preserve">Klíčovou proměnnou zůstává Blízký východ. Hormuzským průlivem v posledních týdnech proplouvá více ropy, silná globální poptávka ale drží její cenu vysoko. Pokud se podaří obnovit volnou plavbu průlivem a opravit saúdský ropovod, ropa může rychle zlevnit, podobně jako na jaře, a s ní by polevila inflace. Pokud konflikt přetrvá, počítáme s dražší energií, vyšší inflací a dalším tlakem na sazby i dluhopisy. Energetická rizika pro inflaci s námi ale zůstanou v každém případě. V Evropě hrozí, že se dražší energie naplno propíše do cen pro domácnosti a firmy až v příštím roce, kdy dodavatelé ceny přecení.</w:t>
+      </w:r>
+    </w:p>
+    <w:p>
+      <w:r>
+        <w:t xml:space="preserve">Druhou proměnnou jsou sazby a veřejné finance. Fed signalizuje ještě jedno zvýšení do konce roku a riziko ještě vyšších sazeb vidíme v USA i v Evropě. Proto pozorně sledujeme vývoj výnosů státních dluhopisů. Trh bude bedlivě sledovat i volby do Kongresu 3. listopadu, předvolební sliby a to, jak snadno se USA dokážou financovat. Případný další prudký růst výnosů by byl hlavním rizikem pro dluhopisy i pro akcie s vysokým oceněním.</w:t>
+      </w:r>
+    </w:p>
+    <w:p>
+      <w:r>
+        <w:t xml:space="preserve">Třetím rizikem je Francie. Kdyby výprodej jejích dluhopisů pokračoval, ohrozil by všechny typy evropských aktiv: dluhopisy, akcie, zejména bank, které francouzské dluhopisy drží, i samotné euro. Otázkou je, jak dlouho francouzský pesimismus vydrží. Podle nás jde spíš o krátkodobou a nárazovou záležitost.</w:t>
+      </w:r>
+    </w:p>
+    <w:p>
+      <w:r>
+        <w:t xml:space="preserve">Oporou trhů zůstávají firemní zisky. Akcie nepadají díky nízké kolísavosti trhu a především díky velmi pozitivnímu výhledu zisků. Analytici pro výsledkovou sezónu za třetí čtvrtletí, která startuje v říjnu, čekají meziroční růst zisků S&amp;P 500 o necelých 30 %. Pokud se to potvrdí, ocenění akcií zůstane rozumné i po letošním růstu. Riziko vidíme hlavně v tom, že by firmy začaly drahou energii a dražší úvěry pociťovat ve svých maržích. Sledujeme také rostoucí rozdíl mezi americkým technologickým sektorem a zbytkem trhu. Čím víc se růst soustředí do jednoho odvětví, tím víc záleží na široké diverzifikaci.</w:t>
       </w:r>
     </w:p>
     <w:p>

</xml_diff>

<commit_message>
3Q 2026 report: clearer France risk premium sentence
Co-Authored-By: Claude <noreply@anthropic.com>
Claude-Session: https://claude.ai/code/session_01Wz4hTuCY2EwSUbAgh1Yfhz
</commit_message>
<xml_diff>
--- a/vystupy/ctvrtletni-zpravy/2026-Q3-Ctvrtletni-zprava-Portu.docx
+++ b/vystupy/ctvrtletni-zpravy/2026-Q3-Ctvrtletni-zprava-Portu.docx
@@ -440,12 +440,12 @@
     </w:p>
     <w:p>
       <w:r>
-        <w:t xml:space="preserve">Totéž se dělo v Evropě. Výnos desetiletého německého dluhopisu vzrostl za čtvrtletí z 2,86 % na 3,58 %. Nejvíce ale byla pod tlakem Francie. Ta si na deset let půjčuje za 4,84 %, dráž než Itálie a o 1,27 procentního bodu dráž než Německo. Tento rozdíl ukazuje, o kolik vyšší odměnu investoři žádají za riziko francouzských veřejných financí, a tak velký nebyl od roku 2012, kdy vrcholila dluhová krize eurozóny.</w:t>
-      </w:r>
-    </w:p>
-    <w:p>
-      <w:r>
-        <w:t xml:space="preserve">Francie potřebuje dlouhodobě ozdravit veřejné finance. Letošní schodek dosáhne 5,4 % HDP místo plánovaných 5 % a dluh se blíží 120 % HDP. Vláda premiéra Lecornua proto navrhuje úspory za 54 miliard eur, v rozděleném parlamentu je ale nemusí prosadit. Nejistotu zvyšují i jarní prezidentské volby. Favoritkou průzkumů je Marine Le Penová a radikálně levicový kandidát Jean-Luc Mélenchon navrhuje zrušit státní dluhopisy, které drží francouzská centrální banka a ECB. Šéfka ECB Christine Lagardeová to označila za čisté porušení evropských smluv. Investoři, pravděpodobně hlavně zahraniční, proto francouzské dluhopisy ve velkém prodávali a žádají za ně vyšší rizikovou přirážku. Zhoršená nálada se přelila i do Itálie, kde výnosy desetiletých dluhopisů za tři měsíce vzrostly zhruba o procentní bod. Německé dluhopisy, které investoři považují za bezpečnější, na samém konci září naopak mírně zpevnily.</w:t>
+        <w:t xml:space="preserve">Totéž se dělo v Evropě. Výnos desetiletého německého dluhopisu vzrostl za čtvrtletí z 2,86 % na 3,58 %. Nejvíce ale byla pod tlakem Francie. Ta si na deset let půjčuje za 4,84 %, dráž než Itálie a o 1,27 procentního bodu dráž než Německo. Právě takovou rizikovou přirážku po ní investoři žádají za nejistotu kolem francouzských veřejných financí. Tak velký rozdíl mezi Francií a Německem nebyl od roku 2012, kdy vrcholila dluhová krize eurozóny.</w:t>
+      </w:r>
+    </w:p>
+    <w:p>
+      <w:r>
+        <w:t xml:space="preserve">Francie potřebuje dlouhodobě ozdravit veřejné finance. Letošní schodek dosáhne 5,4 % HDP místo plánovaných 5 % a dluh se blíží 120 % HDP. Vláda premiéra Lecornua proto navrhuje úspory za 54 miliard eur, v rozděleném parlamentu je ale nemusí prosadit. Nejistotu zvyšují i jarní prezidentské volby. Favoritkou průzkumů je Marine Le Penová a radikálně levicový kandidát Jean-Luc Mélenchon navrhuje zrušit státní dluhopisy, které drží francouzská centrální banka a ECB. Šéfka ECB Christine Lagardeová to označila za čisté porušení evropských smluv. Investoři, pravděpodobně hlavně zahraniční, proto francouzské dluhopisy ve velkém prodávali. Zhoršená nálada se přelila i do Itálie, kde výnosy desetiletých dluhopisů za tři měsíce vzrostly zhruba o procentní bod. Německé dluhopisy, které investoři považují za bezpečnější, na samém konci září naopak mírně zpevnily.</w:t>
       </w:r>
     </w:p>
     <w:p>

</xml_diff>

<commit_message>
3Q 2026 report: remove apposition inserts; prompt rule
Co-Authored-By: Claude <noreply@anthropic.com>
Claude-Session: https://claude.ai/code/session_01Wz4hTuCY2EwSUbAgh1Yfhz
</commit_message>
<xml_diff>
--- a/vystupy/ctvrtletni-zpravy/2026-Q3-Ctvrtletni-zprava-Portu.docx
+++ b/vystupy/ctvrtletni-zpravy/2026-Q3-Ctvrtletni-zprava-Portu.docx
@@ -280,7 +280,7 @@
     </w:p>
     <w:p>
       <w:r>
-        <w:t xml:space="preserve">Ropa Brent tak vstupovala do čtvrtletí kolem 73 dolarů a ve druhé polovině července se vrátila nad 100 dolarů. Na začátku srpna na chvíli zlevnila pod 80 dolarů. Zlom přišel v září: 10. a 11. září zasáhly drony saúdský ropovod East-West, hlavní cestu, kterou Saúdská Arábie vyváží ropu mimo Hormuzský průliv. Ropovod se dočasně uzavřel a Brent v polovině září vystoupal nad 108 dolarů. Čtvrtletí uzavřel těsně pod 100 dolary, o 34 % výš než na jeho začátku. Od začátku roku je ropa dražší zhruba o 60 %.</w:t>
+        <w:t xml:space="preserve">Ropa Brent tak vstupovala do čtvrtletí kolem 73 dolarů a ve druhé polovině července se vrátila nad 100 dolarů. Na začátku srpna na chvíli zlevnila pod 80 dolarů. Zlom přišel v září: 10. a 11. září zasáhly drony saúdský ropovod East-West. Je to hlavní cesta, kterou Saúdská Arábie vyváží ropu mimo Hormuzský průliv. Ropovod se dočasně uzavřel a Brent v polovině září vystoupal nad 108 dolarů. Čtvrtletí uzavřel těsně pod 100 dolary, o 34 % výš než na jeho začátku. Od začátku roku je ropa dražší zhruba o 60 %.</w:t>
       </w:r>
     </w:p>
     <w:p>
@@ -483,7 +483,7 @@
     </w:p>
     <w:p>
       <w:r>
-        <w:t xml:space="preserve">Pod povrchem ale bylo čtvrtletí neklidné. Akcie výrobců čipů a pamětí, hvězdy jara, během července a srpna prudce zlevnily. Investoři začali pochybovat, zda rekordní marže vydrží, a trh znervóznily i pokroky čínských výrobců čipů. Nejvíce to bylo vidět v Jižní Koreji, kde index KOSPI ztratil za čtvrtletí přes 19 %. Slabě si vedly i čínské akcie (CSI 300 −12,5 %) a indické (Sensex −5,2 %). Naopak Hongkong a Tchaj-wan rostly. Rozvojové trhy jako celek tak čtvrtletí zakončily rozpačitě.</w:t>
+        <w:t xml:space="preserve">Mezi jednotlivými sektory ale byly velké rozdíly. Akcie výrobců čipů a pamětí na jaře táhly trh nahoru, během července a srpna ale prudce zlevnily. Investoři začali pochybovat, zda rekordní marže vydrží, a trh znervóznily i pokroky čínských výrobců čipů. Nejvíce to bylo vidět v Jižní Koreji, kde index KOSPI ztratil za čtvrtletí přes 19 %. Slabě si vedly i čínské akcie (CSI 300 −12,5 %) a indické (Sensex −5,2 %). Naopak Hongkong a Tchaj-wan rostly. Rozvojové trhy jako celek tak čtvrtletí zakončily rozpačitě.</w:t>
       </w:r>
     </w:p>
     <w:p>

</xml_diff>

<commit_message>
3Q 2026 report: Hormuz/oil flow data in oil chapter, livelier outlook with key dates
Co-Authored-By: Claude <noreply@anthropic.com>
Claude-Session: https://claude.ai/code/session_01Wz4hTuCY2EwSUbAgh1Yfhz
</commit_message>
<xml_diff>
--- a/vystupy/ctvrtletni-zpravy/2026-Q3-Ctvrtletni-zprava-Portu.docx
+++ b/vystupy/ctvrtletni-zpravy/2026-Q3-Ctvrtletni-zprava-Portu.docx
@@ -275,12 +275,17 @@
     </w:p>
     <w:p>
       <w:r>
-        <w:t xml:space="preserve">Druhé čtvrtletí končilo nadějí. Memorandum mezi USA a Íránem z poloviny června otevřelo Hormuzský průliv a ropa Brent klesla pod 75 dolarů za barel. Už na začátku července ale Írán zaútočil na lodě v průlivu, USA odpověděly údery a Trump dohodu prohlásil za mrtvou. Průlivem se od té doby plavila jen malá část lodí oproti běžnému provozu.</w:t>
-      </w:r>
-    </w:p>
-    <w:p>
-      <w:r>
-        <w:t xml:space="preserve">Ropa Brent tak vstupovala do čtvrtletí kolem 73 dolarů a ve druhé polovině července se vrátila nad 100 dolarů. Na začátku srpna na chvíli zlevnila pod 80 dolarů. Zlom přišel v září: 10. a 11. září zasáhly drony saúdský ropovod East-West. Je to hlavní cesta, kterou Saúdská Arábie vyváží ropu mimo Hormuzský průliv. Ropovod se dočasně uzavřel a Brent v polovině září vystoupal nad 108 dolarů. Čtvrtletí uzavřel těsně pod 100 dolary, o 34 % výš než na jeho začátku. Od začátku roku je ropa dražší zhruba o 60 %.</w:t>
+        <w:t xml:space="preserve">Druhé čtvrtletí končilo nadějí. Memorandum mezi USA a Íránem z poloviny června otevřelo Hormuzský průliv a ropa Brent klesla pod 75 dolarů za barel. Už na začátku července ale Írán zaútočil na lodě v průlivu, USA odpověděly údery a Trump dohodu prohlásil za mrtvou. Zatímco před válkou projelo průlivem se zapnutým transpondérem i přes sto obchodních lodí denně, od března jich jsou jen jednotky.</w:t>
+      </w:r>
+    </w:p>
+    <w:p>
+      <w:r>
+        <w:t xml:space="preserve">Ropa Brent tak vstupovala do čtvrtletí kolem 73 dolarů a ve druhé polovině července se vrátila nad 100 dolarů. Na začátku srpna na chvíli zlevnila pod 80 dolarů. Zlom přišel v září: 10. a 11. září zasáhly drony saúdský ropovod East-West. Je to hlavní cesta, kterou Saúdská Arábie vyváží ropu mimo Hormuzský průliv. Ropovod se dočasně uzavřel a Brent v polovině září vystoupal nad 108 dolarů. Saúdská Arábie ho 22. září znovu spustila a do konce měsíce jím proudilo nejméně 3,5 milionu barelů denně. Čtvrtletí uzavřel těsně pod 100 dolary, o 34 % výš než na jeho začátku. Od začátku roku je ropa dražší zhruba o 60 %.</w:t>
+      </w:r>
+    </w:p>
+    <w:p>
+      <w:r>
+        <w:t xml:space="preserve">Trh se přitom omezením dokázal do značné míry přizpůsobit. Vývoz ropy z Perského zálivu bez Íránu se v září vrátil na více než 80 % předválečné úrovně a Saúdská Arábie ho oproti srpnu zvýšila ze 4,2 na zhruba 6,6 milionu barelů denně. Ropa si našla jiné cesty: zhruba 40 % ropy z regionu teď odchází mimo Hormuzský průliv, před válkou to bylo jen 17 %. Další část se překládá z lodi na loď v Ománském zálivu. Íránský vývoz naopak klesl prakticky na nulu.</w:t>
       </w:r>
     </w:p>
     <w:p>
@@ -506,17 +511,17 @@
     </w:p>
     <w:p>
       <w:r>
-        <w:t xml:space="preserve">Klíčovou proměnnou zůstává Blízký východ. Hormuzským průlivem v posledních týdnech proplouvá více ropy, silná globální poptávka ale drží její cenu vysoko. Pokud se podaří obnovit volnou plavbu průlivem a opravit saúdský ropovod, ropa může rychle zlevnit, podobně jako na jaře, a s ní by polevila inflace. Pokud konflikt přetrvá, počítáme s dražší energií, vyšší inflací a dalším tlakem na sazby i dluhopisy. Energetická rizika pro inflaci s námi ale zůstanou v každém případě. V Evropě hrozí, že se dražší energie naplno propíše do cen pro domácnosti a firmy až v příštím roce, kdy dodavatelé ceny přecení.</w:t>
-      </w:r>
-    </w:p>
-    <w:p>
-      <w:r>
-        <w:t xml:space="preserve">Druhou proměnnou jsou sazby a veřejné finance. Fed signalizuje ještě jedno zvýšení do konce roku a riziko ještě vyšších sazeb vidíme v USA i v Evropě. Proto pozorně sledujeme vývoj výnosů státních dluhopisů. Trh bude bedlivě sledovat i volby do Kongresu 3. listopadu, předvolební sliby a to, jak snadno se USA dokážou financovat. Případný další prudký růst výnosů by byl hlavním rizikem pro dluhopisy i pro akcie s vysokým oceněním.</w:t>
-      </w:r>
-    </w:p>
-    <w:p>
-      <w:r>
-        <w:t xml:space="preserve">Třetím rizikem je Francie. Kdyby výprodej jejích dluhopisů pokračoval, ohrozil by evropské dluhopisy, akcie i samotné euro. Nejvíce by doplatily banky, které francouzské dluhopisy drží. Otázkou je, jak dlouho francouzský pesimismus vydrží. Podle nás jde spíš o krátkodobou a nárazovou záležitost.</w:t>
+        <w:t xml:space="preserve">Ropa zůstane hlavním zdrojem nejistoty i v posledním čtvrtletí. Nabídka se sice postupně obnovuje, ceny ale drží vysoko silná globální poptávka a stále častější útoky na tankery. Pokud by se podařilo obnovit volnou plavbu Hormuzským průlivem, ropa může rychle zlevnit, podobně jako na jaře, a s ní by polevila inflace. Kdyby se konflikt znovu vyostřil, počítáme s dražší energií, vyšší inflací a dalším tlakem na sazby i dluhopisy. Energetická rizika pro inflaci s námi ale zůstanou v každém případě. V Evropě hrozí, že se dražší energie naplno propíše do cen pro domácnosti a firmy až v příštím roce, kdy dodavatelé ceny přecení.</w:t>
+      </w:r>
+    </w:p>
+    <w:p>
+      <w:r>
+        <w:t xml:space="preserve">Do konce roku mají investoři v kalendáři několik důležitých dat. Fed rozhoduje o sazbách 28. října a ECB o den později, 3. listopadu se v USA volí do Kongresu, 5. listopadu zasedá ČNB a poslední zasedání Fedu v roce připadá na 9. prosince. Fed signalizuje ještě jedno zvýšení do konce roku a riziko ještě vyšších sazeb vidíme v USA i v Evropě. Proto pozorně sledujeme vývoj výnosů státních dluhopisů. Případný další prudký růst výnosů by byl hlavním rizikem pro dluhopisy i pro akcie s vysokým oceněním. U voleb do Kongresu bude trh sledovat hlavně předvolební sliby a to, jak snadno se USA dokážou financovat.</w:t>
+      </w:r>
+    </w:p>
+    <w:p>
+      <w:r>
+        <w:t xml:space="preserve">Rizikem pro evropská aktiva zůstává Francie. Kdyby výprodej jejích dluhopisů pokračoval, ohrozil by evropské dluhopisy, akcie i samotné euro. Nejvíce by doplatily banky, které francouzské dluhopisy drží. Otázkou je, jak dlouho francouzský pesimismus vydrží. Podle nás jde spíš o krátkodobou a nárazovou záležitost.</w:t>
       </w:r>
     </w:p>
     <w:p>

</xml_diff>

<commit_message>
3Q 2026 report: tighten outlook, explain crack spread, remove repetitions
Co-Authored-By: Claude <noreply@anthropic.com>
Claude-Session: https://claude.ai/code/session_01Wz4hTuCY2EwSUbAgh1Yfhz
</commit_message>
<xml_diff>
--- a/vystupy/ctvrtletni-zpravy/2026-Q3-Ctvrtletni-zprava-Portu.docx
+++ b/vystupy/ctvrtletni-zpravy/2026-Q3-Ctvrtletni-zprava-Portu.docx
@@ -511,17 +511,17 @@
     </w:p>
     <w:p>
       <w:r>
-        <w:t xml:space="preserve">Ropa zůstane hlavním zdrojem nejistoty i v posledním čtvrtletí. Nabídka surové ropy se sice postupně obnovuje, chybí ale kapacity na její zpracování. Ukrajinské drony od začátku roku zasáhly ruské rafinerie nejméně 70krát, Rusko zpracovává nejméně ropy za dvě desetiletí a vývoz nafty zakázalo. Rafinerie v Perském zálivu navíc vyvážejí jen asi 60 % předválečného objemu paliv. Nejvíc je to vidět na naftě. Rozdíl mezi cenou nafty a ropy se v září dostal na rekordní úroveň, a nafta proto zdražila mnohem víc než benzin. Evropu to zasahuje víc než jiné regiony, protože od roku 2009 zavřela zhruba 30 rafinerií a naftu dováží. Ceny navíc drží vysoko silná globální poptávka a stále častější útoky na tankery. Pokud by se podařilo obnovit volnou plavbu Hormuzským průlivem, ropa může rychle zlevnit, podobně jako na jaře, a s ní by polevila inflace. Kdyby se konflikt znovu vyostřil, počítáme s dražší energií, vyšší inflací a dalším tlakem na sazby i dluhopisy. Energetická rizika pro inflaci s námi ale zůstanou v každém případě. V Evropě hrozí, že se dražší energie naplno propíše do cen pro domácnosti a firmy až v příštím roce, kdy dodavatelé ceny přecení.</w:t>
-      </w:r>
-    </w:p>
-    <w:p>
-      <w:r>
-        <w:t xml:space="preserve">Do konce roku mají investoři v kalendáři několik důležitých dat. Fed rozhoduje o sazbách 28. října a ECB o den později, 3. listopadu se v USA volí do Kongresu, 5. listopadu zasedá ČNB a poslední zasedání Fedu v roce připadá na 9. prosince. Fed signalizuje ještě jedno zvýšení do konce roku a riziko ještě vyšších sazeb vidíme v USA i v Evropě. Proto pozorně sledujeme vývoj výnosů státních dluhopisů. Případný další prudký růst výnosů by byl hlavním rizikem pro dluhopisy i pro akcie s vysokým oceněním. U voleb do Kongresu bude trh sledovat hlavně předvolební sliby a to, jak snadno se USA dokážou financovat.</w:t>
-      </w:r>
-    </w:p>
-    <w:p>
-      <w:r>
-        <w:t xml:space="preserve">Rizikem pro evropská aktiva zůstává Francie. Kdyby výprodej jejích dluhopisů pokračoval, ohrozil by evropské dluhopisy, akcie i samotné euro. Nejvíce by doplatily banky, které francouzské dluhopisy drží. Otázkou je, jak dlouho francouzský pesimismus vydrží. Podle nás jde spíš o krátkodobou a nárazovou záležitost.</w:t>
+        <w:t xml:space="preserve">Ropa zůstane hlavním zdrojem nejistoty i v posledním čtvrtletí. Surové ropy je na trhu postupně víc, ceny ale drží vysoko silná globální poptávka a nedostatek kapacit na její zpracování. Ukrajinské drony letos zasáhly ruské rafinerie nejméně 70krát a Rusko kvůli tomu zakázalo vývoz nafty. Rafinerie v Perském zálivu navíc vyvážejí jen asi 60 % předválečného objemu paliv. Nejvíc se to projevuje na naftě. Takzvaný crack spread, tedy rozdíl mezi cenou nafty a ropy, ukazuje, kolik rafinerie vydělají na zpracování jednoho barelu. V září vystoupal na rekordních zhruba 100 dolarů, protože nafty je nedostatek a kupci jsou ochotní za ni platit výrazně víc. Nafta proto zdražila mnohem víc než benzin a nejvíc to pocítí Evropa, která naftu dováží. Pokud by se podařilo obnovit volnou plavbu Hormuzským průlivem, ropa může rychle zlevnit, podobně jako na jaře, při novém vyostření konfliktu by naopak dál zdražovala. Energetická rizika pro inflaci s námi ale zůstanou v každém případě a v Evropě se dražší energie naplno propíše do cen pro domácnosti a firmy pravděpodobně až v příštím roce, kdy dodavatelé ceny přecení.</w:t>
+      </w:r>
+    </w:p>
+    <w:p>
+      <w:r>
+        <w:t xml:space="preserve">Do konce roku mají investoři v kalendáři několik důležitých dat. Fed rozhoduje o sazbách 28. října a 9. prosince, ECB 29. října a ČNB 5. listopadu, 3. listopadu se navíc v USA volí do Kongresu. Na zasedáních centrálních bank se ukáže, zda už je zvyšování sazeb u konce, nebo zda budou muset přitlačit ještě víc. Pro dluhopisy i pro akcie s vysokým oceněním by byl hlavním rizikem další prudký růst výnosů, a proto jejich vývoj pozorně sledujeme.</w:t>
+      </w:r>
+    </w:p>
+    <w:p>
+      <w:r>
+        <w:t xml:space="preserve">Francouzský výprodej dluhopisů považujeme spíš za krátkodobou a nárazovou záležitost. Kdyby ale pokračoval, stal by se rizikem pro evropské dluhopisy, akcie i euro.</w:t>
       </w:r>
     </w:p>
     <w:p>
@@ -531,7 +531,7 @@
     </w:p>
     <w:p>
       <w:r>
-        <w:t xml:space="preserve">Pro naše portfolia bylo třetí čtvrtletí po silném jaru mírně ztrátové. Všechna ale zůstávají od začátku roku v plusu a americké dluhopisy dnes nabízejí nejvyšší výnosy za téměř dvě dekády. Krátkodobé výkyvy způsobené ropou nebo sazbami patří k investování a dlouhodobému investorovi nejlépe slouží disciplína a pravidelné vklady, ne pokusy odhadnout další zvrat. Jak napsal Benjamin Graham: „Hlavním problémem investora, a dokonce jeho nejhorším nepřítelem, bude nejspíš on sám.“</w:t>
+        <w:t xml:space="preserve">Třetí čtvrtletí ukázalo, že i v roce, kdy se portfoliím daří, přijdou měsíce, které výsledek na chvíli srazí. Krátkodobé výkyvy způsobené ropou nebo sazbami k investování patří a dlouhodobému investorovi nejlépe slouží disciplína a pravidelné vklady, ne pokusy odhadnout další zvrat. Jak napsal Benjamin Graham: „Hlavním problémem investora, a dokonce jeho nejhorším nepřítelem, bude nejspíš on sám.“</w:t>
       </w:r>
     </w:p>
     <w:p>

</xml_diff>

<commit_message>
3Q 2026 report: move refinery/diesel facts from outlook to oil chapter; prompt rule
Co-Authored-By: Claude <noreply@anthropic.com>
Claude-Session: https://claude.ai/code/session_01Wz4hTuCY2EwSUbAgh1Yfhz
</commit_message>
<xml_diff>
--- a/vystupy/ctvrtletni-zpravy/2026-Q3-Ctvrtletni-zprava-Portu.docx
+++ b/vystupy/ctvrtletni-zpravy/2026-Q3-Ctvrtletni-zprava-Portu.docx
@@ -290,6 +290,11 @@
     </w:p>
     <w:p>
       <w:r>
+        <w:t xml:space="preserve">Úzkým hrdlem se ale staly rafinerie. Ukrajinské drony letos zasáhly ruské rafinerie nejméně 70krát a Rusko kvůli tomu zakázalo vývoz nafty. Rafinerie v Perském zálivu navíc vyvážely jen asi 60 % předválečného objemu paliv. Nejvíc se to projevilo na naftě. Takzvaný crack spread, tedy rozdíl mezi cenou nafty a ropy, ukazuje, kolik rafinerie vydělají na zpracování jednoho barelu. V září vystoupal na rekordních zhruba 100 dolarů, protože nafty byl nedostatek a kupci byli ochotní za ni platit výrazně víc. Nafta proto zdražila mnohem víc než benzin a nejvíc to pocítila Evropa, která naftu dováží.</w:t>
+      </w:r>
+    </w:p>
+    <w:p>
+      <w:r>
         <w:t xml:space="preserve">Drahá ropa se okamžitě propsala do cen pohonných hmot i inflačních očekávání. Pro akcie energetických firem to byla dobrá zpráva, pro zbytek ekonomiky naopak zátěž. Nejvíce jsou jí vystaveny Evropa a Asie, které ropu dovážejí. Americká ekonomika se ale ukázala jako překvapivě odolná. Podle poslední revize rostla ve druhém čtvrtletí v ročním přepočtu o 2,2 %, o 0,7 procentního bodu rychleji, než ukazoval předchozí odhad, a navázala tak na růst o 2,5 % v prvním čtvrtletí. Táhly ji hlavně investice firem, především výstavba datových center, a k tomu spotřeba domácností a vládní výdaje. Dražší ropa i silná ekonomika zároveň daly Fedu důvod zvýšit sazby, o čemž píšeme v další kapitole.</w:t>
       </w:r>
     </w:p>
@@ -511,7 +516,7 @@
     </w:p>
     <w:p>
       <w:r>
-        <w:t xml:space="preserve">Ropa zůstane hlavním zdrojem nejistoty i v posledním čtvrtletí. Surové ropy je na trhu postupně víc, ceny ale drží vysoko silná globální poptávka a nedostatek kapacit na její zpracování. Ukrajinské drony letos zasáhly ruské rafinerie nejméně 70krát a Rusko kvůli tomu zakázalo vývoz nafty. Rafinerie v Perském zálivu navíc vyvážejí jen asi 60 % předválečného objemu paliv. Nejvíc se to projevuje na naftě. Takzvaný crack spread, tedy rozdíl mezi cenou nafty a ropy, ukazuje, kolik rafinerie vydělají na zpracování jednoho barelu. V září vystoupal na rekordních zhruba 100 dolarů, protože nafty je nedostatek a kupci jsou ochotní za ni platit výrazně víc. Nafta proto zdražila mnohem víc než benzin a nejvíc to pocítí Evropa, která naftu dováží. Pokud by se podařilo obnovit volnou plavbu Hormuzským průlivem, ropa může rychle zlevnit, podobně jako na jaře, při novém vyostření konfliktu by naopak dál zdražovala. Energetická rizika pro inflaci s námi ale zůstanou v každém případě a v Evropě se dražší energie naplno propíše do cen pro domácnosti a firmy pravděpodobně až v příštím roce, kdy dodavatelé ceny přecení.</w:t>
+        <w:t xml:space="preserve">Ropa zůstane hlavním zdrojem nejistoty i v posledním čtvrtletí. Surové ropy je na trhu postupně víc, ceny ale bude dál držet vysoko silná globální poptávka a nedostatek kapacit na její zpracování. Pokud by se podařilo obnovit volnou plavbu Hormuzským průlivem, ropa může rychle zlevnit, podobně jako na jaře, při novém vyostření konfliktu by naopak dál zdražovala. Energetická rizika pro inflaci s námi ale zůstanou v každém případě a v Evropě se dražší energie naplno propíše do cen pro domácnosti a firmy pravděpodobně až v příštím roce, kdy dodavatelé ceny přecení.</w:t>
       </w:r>
     </w:p>
     <w:p>

</xml_diff>

<commit_message>
3Q 2026 report: write investment strategy evaluation; move small-cap paragraph there
Co-Authored-By: Claude <noreply@anthropic.com>
Claude-Session: https://claude.ai/code/session_01Wz4hTuCY2EwSUbAgh1Yfhz
</commit_message>
<xml_diff>
--- a/vystupy/ctvrtletni-zpravy/2026-Q3-Ctvrtletni-zprava-Portu.docx
+++ b/vystupy/ctvrtletni-zpravy/2026-Q3-Ctvrtletni-zprava-Portu.docx
@@ -469,11 +469,6 @@
       </w:r>
     </w:p>
     <w:p>
-      <w:r>
-        <w:t xml:space="preserve">Vyšší sazby dopadly i na akcie menších firem, které jsou na levných penězích více závislé. Americký index malých firem Russell 2000 v polovině srpna pokořil rekord, do konce září ale odepsal téměř 9 % a za celé čtvrtletí ztratil 7,5 %. Globální akcie malých firem drží rizikové profily 4–10 a jsou jedním z důvodů slabšího výsledku i u dynamických portfolií.</w:t>
-      </w:r>
-    </w:p>
-    <w:p>
       <w:pPr>
         <w:pStyle w:val="Heading2"/>
       </w:pPr>
@@ -549,11 +544,27 @@
     </w:p>
     <w:p>
       <w:r>
-        <w:rPr>
-          <w:highlight w:val="yellow"/>
-          <w:highlightCs w:val="yellow"/>
-        </w:rPr>
-        <w:t xml:space="preserve">[DOPLNIT: evaluace investiční strategie – doplní Portu po schválení investiční komisí]</w:t>
+        <w:t xml:space="preserve">Investiční komise se schází pravidelně a vývoj třetího čtvrtletí jsme spolu podrobně prošli. Na plánu, o kterém jsme psali v předchozích zprávách, nic neměníme. Uplynulé tři měsíce nám naopak potvrdily, že míří správným směrem.</w:t>
+      </w:r>
+    </w:p>
+    <w:p>
+      <w:r>
+        <w:t xml:space="preserve">Prvním krokem je posílení amerických akcií. Americké firmy dál zvyšují zisky rychleji, než analytici čekali, a americká ekonomika se i přes drahou ropu a vyšší sazby ukázala jako odolná. Americké akcie se ve třetím čtvrtletí z hlavních tříd aktiv vedly nejlépe.</w:t>
+      </w:r>
+    </w:p>
+    <w:p>
+      <w:r>
+        <w:t xml:space="preserve">Prostor pro vyšší váhu Ameriky chceme získat hlavně snížením podílu globálních akcií malých firem. Vývoj ve třetím čtvrtletí tento krok podpořil. Americký index malých firem Russell 2000 od 30. června do 30. září ztratil 7,5 %, zatímco index velkých firem S&amp;P 500 ve stejném období rostl. Menší firmy jsou víc závislé na úvěrech, a když sazby rostou, jejich financování zdražuje rychleji než u velkých firem. Výhled na další zvyšování sazeb jim proto nepřeje.</w:t>
+      </w:r>
+    </w:p>
+    <w:p>
+      <w:r>
+        <w:t xml:space="preserve">Třetí změnou je odchod z dlouhodobých amerických státních dluhopisů. Do prostředí, kde inflace zůstává zvýšená a centrální banky sazby spíš zvyšují, nesedí. Jejich cena na růst sazeb reaguje nejcitlivěji, a proto byly ve třetím čtvrtletí nejslabší třídou aktiv v našich portfoliích. Kratší dluhopisy dnes nabízejí zajímavý výnos s mnohem menším kolísáním.</w:t>
+      </w:r>
+    </w:p>
+    <w:p>
+      <w:r>
+        <w:t xml:space="preserve">Kdy přesně změny provedeme, rozhodne komise podle vývoje na trzích. Klienti s aktivním režimem schvalování změn se o nich dozví s předstihem a sami rozhodnou, zda je přijmou.</w:t>
       </w:r>
     </w:p>
     <w:p>

</xml_diff>